<commit_message>
Vista de n logs en Opcion 4 de Validacion de Conexion Dyantrace
</commit_message>
<xml_diff>
--- a/Manual_Gestion_Dynatrace_v3.docx
+++ b/Manual_Gestion_Dynatrace_v3.docx
@@ -44,7 +44,14 @@
           <w:color w:val="555555"/>
           <w:lang w:val="es-PE"/>
         </w:rPr>
-        <w:t xml:space="preserve">creación de cuenta free, instalación y </w:t>
+        <w:t>C</w:t>
+      </w:r>
+      <w:r>
+        <w:rPr>
+          <w:color w:val="555555"/>
+          <w:lang w:val="es-PE"/>
+        </w:rPr>
+        <w:t xml:space="preserve">reación de cuenta free, instalación y </w:t>
       </w:r>
       <w:r>
         <w:rPr>
@@ -355,7 +362,7 @@
             <w:noProof/>
             <w:webHidden/>
           </w:rPr>
-          <w:t>2</w:t>
+          <w:t>3</w:t>
         </w:r>
         <w:r>
           <w:rPr>
@@ -433,7 +440,7 @@
             <w:noProof/>
             <w:webHidden/>
           </w:rPr>
-          <w:t>2</w:t>
+          <w:t>3</w:t>
         </w:r>
         <w:r>
           <w:rPr>
@@ -590,7 +597,7 @@
             <w:noProof/>
             <w:webHidden/>
           </w:rPr>
-          <w:t>3</w:t>
+          <w:t>4</w:t>
         </w:r>
         <w:r>
           <w:rPr>
@@ -669,7 +676,7 @@
             <w:noProof/>
             <w:webHidden/>
           </w:rPr>
-          <w:t>3</w:t>
+          <w:t>4</w:t>
         </w:r>
         <w:r>
           <w:rPr>
@@ -748,7 +755,7 @@
             <w:noProof/>
             <w:webHidden/>
           </w:rPr>
-          <w:t>4</w:t>
+          <w:t>7</w:t>
         </w:r>
         <w:r>
           <w:rPr>
@@ -827,7 +834,7 @@
             <w:noProof/>
             <w:webHidden/>
           </w:rPr>
-          <w:t>5</w:t>
+          <w:t>7</w:t>
         </w:r>
         <w:r>
           <w:rPr>
@@ -906,7 +913,7 @@
             <w:noProof/>
             <w:webHidden/>
           </w:rPr>
-          <w:t>5</w:t>
+          <w:t>8</w:t>
         </w:r>
         <w:r>
           <w:rPr>
@@ -985,7 +992,7 @@
             <w:noProof/>
             <w:webHidden/>
           </w:rPr>
-          <w:t>6</w:t>
+          <w:t>9</w:t>
         </w:r>
         <w:r>
           <w:rPr>
@@ -1064,7 +1071,7 @@
             <w:noProof/>
             <w:webHidden/>
           </w:rPr>
-          <w:t>7</w:t>
+          <w:t>10</w:t>
         </w:r>
         <w:r>
           <w:rPr>
@@ -1143,7 +1150,7 @@
             <w:noProof/>
             <w:webHidden/>
           </w:rPr>
-          <w:t>7</w:t>
+          <w:t>10</w:t>
         </w:r>
         <w:r>
           <w:rPr>
@@ -1222,7 +1229,7 @@
             <w:noProof/>
             <w:webHidden/>
           </w:rPr>
-          <w:t>8</w:t>
+          <w:t>11</w:t>
         </w:r>
         <w:r>
           <w:rPr>
@@ -1301,7 +1308,7 @@
             <w:noProof/>
             <w:webHidden/>
           </w:rPr>
-          <w:t>8</w:t>
+          <w:t>11</w:t>
         </w:r>
         <w:r>
           <w:rPr>
@@ -1379,7 +1386,7 @@
             <w:noProof/>
             <w:webHidden/>
           </w:rPr>
-          <w:t>9</w:t>
+          <w:t>12</w:t>
         </w:r>
         <w:r>
           <w:rPr>
@@ -1458,7 +1465,7 @@
             <w:noProof/>
             <w:webHidden/>
           </w:rPr>
-          <w:t>9</w:t>
+          <w:t>12</w:t>
         </w:r>
         <w:r>
           <w:rPr>
@@ -3905,15 +3912,7 @@
                                   <w:bCs/>
                                   <w:lang w:val="es-PE"/>
                                 </w:rPr>
-                                <w:t>Opción</w:t>
-                              </w:r>
-                              <w:r>
-                                <w:rPr>
-                                  <w:b/>
-                                  <w:bCs/>
-                                  <w:lang w:val="es-PE"/>
-                                </w:rPr>
-                                <w:t xml:space="preserve"> 1</w:t>
+                                <w:t>Opción 1</w:t>
                               </w:r>
                             </w:p>
                           </w:txbxContent>
@@ -3981,15 +3980,7 @@
                             <w:bCs/>
                             <w:lang w:val="es-PE"/>
                           </w:rPr>
-                          <w:t>Opción</w:t>
-                        </w:r>
-                        <w:r>
-                          <w:rPr>
-                            <w:b/>
-                            <w:bCs/>
-                            <w:lang w:val="es-PE"/>
-                          </w:rPr>
-                          <w:t xml:space="preserve"> 1</w:t>
+                          <w:t>Opción 1</w:t>
                         </w:r>
                       </w:p>
                     </w:txbxContent>
@@ -4032,6 +4023,195 @@
     <w:p>
       <w:pPr>
         <w:pStyle w:val="Listaconvietas"/>
+        <w:numPr>
+          <w:ilvl w:val="0"/>
+          <w:numId w:val="0"/>
+        </w:numPr>
+        <w:spacing w:after="80"/>
+        <w:ind w:left="360"/>
+        <w:rPr>
+          <w:lang w:val="es-PE"/>
+        </w:rPr>
+      </w:pPr>
+      <w:r>
+        <w:rPr>
+          <w:noProof/>
+          <w:lang w:val="es-PE"/>
+        </w:rPr>
+        <mc:AlternateContent>
+          <mc:Choice Requires="wpc">
+            <w:drawing>
+              <wp:inline distT="0" distB="0" distL="0" distR="0" wp14:anchorId="3B8D0396" wp14:editId="2BCF6005">
+                <wp:extent cx="5537200" cy="662305"/>
+                <wp:effectExtent l="0" t="0" r="6350" b="4445"/>
+                <wp:docPr id="442535764" name="Lienzo 2"/>
+                <wp:cNvGraphicFramePr>
+                  <a:graphicFrameLocks xmlns:a="http://schemas.openxmlformats.org/drawingml/2006/main" noChangeAspect="1"/>
+                </wp:cNvGraphicFramePr>
+                <a:graphic xmlns:a="http://schemas.openxmlformats.org/drawingml/2006/main">
+                  <a:graphicData uri="http://schemas.microsoft.com/office/word/2010/wordprocessingCanvas">
+                    <wpc:wpc>
+                      <wpc:bg>
+                        <a:solidFill>
+                          <a:prstClr val="white"/>
+                        </a:solidFill>
+                      </wpc:bg>
+                      <wpc:whole/>
+                      <wps:wsp>
+                        <wps:cNvPr id="1091165219" name="Rectángulo: esquinas redondeadas 1091165219"/>
+                        <wps:cNvSpPr/>
+                        <wps:spPr>
+                          <a:xfrm>
+                            <a:off x="1860550" y="139700"/>
+                            <a:ext cx="1689100" cy="400050"/>
+                          </a:xfrm>
+                          <a:prstGeom prst="roundRect">
+                            <a:avLst/>
+                          </a:prstGeom>
+                          <a:gradFill flip="none" rotWithShape="1">
+                            <a:gsLst>
+                              <a:gs pos="0">
+                                <a:schemeClr val="accent4">
+                                  <a:lumMod val="67000"/>
+                                </a:schemeClr>
+                              </a:gs>
+                              <a:gs pos="48000">
+                                <a:schemeClr val="accent4">
+                                  <a:lumMod val="97000"/>
+                                  <a:lumOff val="3000"/>
+                                </a:schemeClr>
+                              </a:gs>
+                              <a:gs pos="100000">
+                                <a:schemeClr val="accent4">
+                                  <a:lumMod val="60000"/>
+                                  <a:lumOff val="40000"/>
+                                </a:schemeClr>
+                              </a:gs>
+                            </a:gsLst>
+                            <a:lin ang="16200000" scaled="1"/>
+                            <a:tileRect/>
+                          </a:gradFill>
+                          <a:ln>
+                            <a:noFill/>
+                          </a:ln>
+                        </wps:spPr>
+                        <wps:style>
+                          <a:lnRef idx="0">
+                            <a:scrgbClr r="0" g="0" b="0"/>
+                          </a:lnRef>
+                          <a:fillRef idx="0">
+                            <a:scrgbClr r="0" g="0" b="0"/>
+                          </a:fillRef>
+                          <a:effectRef idx="0">
+                            <a:scrgbClr r="0" g="0" b="0"/>
+                          </a:effectRef>
+                          <a:fontRef idx="minor">
+                            <a:schemeClr val="lt1"/>
+                          </a:fontRef>
+                        </wps:style>
+                        <wps:txbx>
+                          <w:txbxContent>
+                            <w:p>
+                              <w:pPr>
+                                <w:pStyle w:val="Listaconvietas"/>
+                                <w:numPr>
+                                  <w:ilvl w:val="0"/>
+                                  <w:numId w:val="0"/>
+                                </w:numPr>
+                                <w:spacing w:after="0"/>
+                                <w:jc w:val="center"/>
+                                <w:rPr>
+                                  <w:b/>
+                                  <w:bCs/>
+                                </w:rPr>
+                              </w:pPr>
+                              <w:r>
+                                <w:rPr>
+                                  <w:b/>
+                                  <w:bCs/>
+                                  <w:lang w:val="es-PE"/>
+                                </w:rPr>
+                                <w:t xml:space="preserve">Opción </w:t>
+                              </w:r>
+                              <w:r>
+                                <w:rPr>
+                                  <w:b/>
+                                  <w:bCs/>
+                                  <w:lang w:val="es-PE"/>
+                                </w:rPr>
+                                <w:t>4 y 5</w:t>
+                              </w:r>
+                            </w:p>
+                          </w:txbxContent>
+                        </wps:txbx>
+                        <wps:bodyPr rot="0" spcFirstLastPara="0" vertOverflow="overflow" horzOverflow="overflow" vert="horz" wrap="square" lIns="91440" tIns="45720" rIns="91440" bIns="45720" numCol="1" spcCol="0" rtlCol="0" fromWordArt="0" anchor="ctr" anchorCtr="0" forceAA="0" compatLnSpc="1">
+                          <a:prstTxWarp prst="textNoShape">
+                            <a:avLst/>
+                          </a:prstTxWarp>
+                          <a:noAutofit/>
+                        </wps:bodyPr>
+                      </wps:wsp>
+                    </wpc:wpc>
+                  </a:graphicData>
+                </a:graphic>
+              </wp:inline>
+            </w:drawing>
+          </mc:Choice>
+          <mc:Fallback>
+            <w:pict>
+              <v:group w14:anchorId="3B8D0396" id="_x0000_s1029" editas="canvas" style="width:436pt;height:52.15pt;mso-position-horizontal-relative:char;mso-position-vertical-relative:line" coordsize="55372,6623" o:gfxdata="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">
+                <v:shape id="_x0000_s1030" type="#_x0000_t75" style="position:absolute;width:55372;height:6623;visibility:visible;mso-wrap-style:square" filled="t">
+                  <v:fill o:detectmouseclick="t"/>
+                  <v:path o:connecttype="none"/>
+                </v:shape>
+                <v:roundrect id="Rectángulo: esquinas redondeadas 1091165219" o:spid="_x0000_s1031" style="position:absolute;left:18605;top:1397;width:16891;height:4000;visibility:visible;mso-wrap-style:square;v-text-anchor:middle" arcsize="10923f" o:gfxdata="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" fillcolor="#55416d [2151]" stroked="f">
+                  <v:fill color2="#b2a1c7 [1943]" rotate="t" angle="180" colors="0 #56426e;31457f #8469a5;1 #b3a2c7" focus="100%" type="gradient"/>
+                  <v:textbox>
+                    <w:txbxContent>
+                      <w:p>
+                        <w:pPr>
+                          <w:pStyle w:val="Listaconvietas"/>
+                          <w:numPr>
+                            <w:ilvl w:val="0"/>
+                            <w:numId w:val="0"/>
+                          </w:numPr>
+                          <w:spacing w:after="0"/>
+                          <w:jc w:val="center"/>
+                          <w:rPr>
+                            <w:b/>
+                            <w:bCs/>
+                          </w:rPr>
+                        </w:pPr>
+                        <w:r>
+                          <w:rPr>
+                            <w:b/>
+                            <w:bCs/>
+                            <w:lang w:val="es-PE"/>
+                          </w:rPr>
+                          <w:t xml:space="preserve">Opción </w:t>
+                        </w:r>
+                        <w:r>
+                          <w:rPr>
+                            <w:b/>
+                            <w:bCs/>
+                            <w:lang w:val="es-PE"/>
+                          </w:rPr>
+                          <w:t>4 y 5</w:t>
+                        </w:r>
+                      </w:p>
+                    </w:txbxContent>
+                  </v:textbox>
+                </v:roundrect>
+                <w10:anchorlock/>
+              </v:group>
+            </w:pict>
+          </mc:Fallback>
+        </mc:AlternateContent>
+      </w:r>
+    </w:p>
+    <w:p>
+      <w:pPr>
+        <w:pStyle w:val="Listaconvietas"/>
         <w:spacing w:after="80"/>
         <w:rPr>
           <w:lang w:val="es-PE"/>
@@ -4320,6 +4500,7 @@
         <w:rPr>
           <w:lang w:val="es-PE"/>
         </w:rPr>
+        <w:lastRenderedPageBreak/>
         <w:t xml:space="preserve">Confirmar la </w:t>
       </w:r>
       <w:r>
@@ -4365,7 +4546,6 @@
         <w:rPr>
           <w:lang w:val="es-PE"/>
         </w:rPr>
-        <w:lastRenderedPageBreak/>
         <w:t xml:space="preserve">Revisar que la conectividad saliente hacia Dynatrace no </w:t>
       </w:r>
       <w:r>
@@ -7052,48 +7232,92 @@
     <w:pPr>
       <w:pStyle w:val="Piedepgina"/>
       <w:jc w:val="center"/>
+      <w:rPr>
+        <w:color w:val="4F81BD" w:themeColor="accent1"/>
+      </w:rPr>
     </w:pPr>
     <w:r>
       <w:rPr>
-        <w:color w:val="555555"/>
-        <w:sz w:val="18"/>
-      </w:rPr>
-      <w:t xml:space="preserve">Manual de Gestion </w:t>
-    </w:r>
-    <w:proofErr w:type="spellStart"/>
-    <w:r>
-      <w:rPr>
-        <w:color w:val="555555"/>
-        <w:sz w:val="18"/>
-      </w:rPr>
-      <w:t>en</w:t>
-    </w:r>
-    <w:proofErr w:type="spellEnd"/>
-    <w:r>
-      <w:rPr>
-        <w:color w:val="555555"/>
-        <w:sz w:val="18"/>
-      </w:rPr>
-      <w:t xml:space="preserve"> Dynatrace - </w:t>
+        <w:color w:val="4F81BD" w:themeColor="accent1"/>
+        <w:lang w:val="es-ES"/>
+      </w:rPr>
+      <w:t xml:space="preserve">Página </w:t>
     </w:r>
     <w:r>
+      <w:rPr>
+        <w:color w:val="4F81BD" w:themeColor="accent1"/>
+      </w:rPr>
       <w:fldChar w:fldCharType="begin"/>
     </w:r>
     <w:r>
-      <w:instrText>PAGE</w:instrText>
+      <w:rPr>
+        <w:color w:val="4F81BD" w:themeColor="accent1"/>
+      </w:rPr>
+      <w:instrText>PAGE  \* Arabic  \* MERGEFORMAT</w:instrText>
     </w:r>
     <w:r>
+      <w:rPr>
+        <w:color w:val="4F81BD" w:themeColor="accent1"/>
+      </w:rPr>
       <w:fldChar w:fldCharType="separate"/>
     </w:r>
     <w:r>
       <w:rPr>
-        <w:noProof/>
-      </w:rPr>
-      <w:t>1</w:t>
+        <w:color w:val="4F81BD" w:themeColor="accent1"/>
+        <w:lang w:val="es-ES"/>
+      </w:rPr>
+      <w:t>2</w:t>
     </w:r>
     <w:r>
+      <w:rPr>
+        <w:color w:val="4F81BD" w:themeColor="accent1"/>
+      </w:rPr>
       <w:fldChar w:fldCharType="end"/>
     </w:r>
+    <w:r>
+      <w:rPr>
+        <w:color w:val="4F81BD" w:themeColor="accent1"/>
+        <w:lang w:val="es-ES"/>
+      </w:rPr>
+      <w:t xml:space="preserve"> de </w:t>
+    </w:r>
+    <w:r>
+      <w:rPr>
+        <w:color w:val="4F81BD" w:themeColor="accent1"/>
+      </w:rPr>
+      <w:fldChar w:fldCharType="begin"/>
+    </w:r>
+    <w:r>
+      <w:rPr>
+        <w:color w:val="4F81BD" w:themeColor="accent1"/>
+      </w:rPr>
+      <w:instrText>NUMPAGES  \* Arabic  \* MERGEFORMAT</w:instrText>
+    </w:r>
+    <w:r>
+      <w:rPr>
+        <w:color w:val="4F81BD" w:themeColor="accent1"/>
+      </w:rPr>
+      <w:fldChar w:fldCharType="separate"/>
+    </w:r>
+    <w:r>
+      <w:rPr>
+        <w:color w:val="4F81BD" w:themeColor="accent1"/>
+        <w:lang w:val="es-ES"/>
+      </w:rPr>
+      <w:t>2</w:t>
+    </w:r>
+    <w:r>
+      <w:rPr>
+        <w:color w:val="4F81BD" w:themeColor="accent1"/>
+      </w:rPr>
+      <w:fldChar w:fldCharType="end"/>
+    </w:r>
+  </w:p>
+  <w:p>
+    <w:pPr>
+      <w:pStyle w:val="Piedepgina"/>
+      <w:jc w:val="center"/>
+    </w:pPr>
   </w:p>
 </w:ftr>
 </file>

</xml_diff>